<commit_message>
fix(search): populate fengxing 4-row delta column from history
The upper 4-row table in section 六.1 (豐興盤價) had hardcoded "+0" in
the 價差 cells while the lower section 七 history tables already
computed correct deltas. Pull current-week (h0) deltas from history
into the upper table.

Mapping rules (per user):
  - SD280  -> hist_sd280_v_h0
  - SD280W -> hist_sd280_v_h0  (SD280W = SD280 + 200 constant premium)
  - SD420  -> hist_sd420w_v_h0 (SD420 = SD420W parity)
  - SD420W -> hist_sd420w_v_h0

Changes:
  - slot_schema: define fx_sd280w_delta and fx_sd420_delta SlotDef
  - orchestrator._node_narrate: copy h0 history deltas into fx_*_delta
    with matching confidence
  - meeting_template.docx: replace 4 hardcoded "+0" cells with
    {{fx_sd280_delta}} / {{fx_sd280w_delta}} / {{fx_sd420_delta}} /
    {{fx_sd420w_delta}}
</commit_message>
<xml_diff>
--- a/backend/templates/meeting_template.docx
+++ b/backend/templates/meeting_template.docx
@@ -2382,18 +2382,8 @@
             <w:vAlign w:val="center"/>
           </w:tcPr>
           <w:p>
-            <w:pPr>
-              <w:jc w:val="center"/>
-            </w:pPr>
-            <w:r/>
-            <w:r>
-              <w:rPr>
-                <w:b w:val="0"/>
-                <w:color w:val="C00000"/>
-                <w:sz w:val="22"/>
-                <w:rFonts w:eastAsia="Microsoft JhengHei" w:ascii="Calibri" w:hAnsi="Calibri"/>
-              </w:rPr>
-              <w:t>+0</w:t>
+            <w:r>
+              <w:t>{{fx_sd280_delta}}</w:t>
             </w:r>
           </w:p>
         </w:tc>
@@ -2445,18 +2435,8 @@
             <w:vAlign w:val="center"/>
           </w:tcPr>
           <w:p>
-            <w:pPr>
-              <w:jc w:val="center"/>
-            </w:pPr>
-            <w:r/>
-            <w:r>
-              <w:rPr>
-                <w:b w:val="0"/>
-                <w:color w:val="C00000"/>
-                <w:sz w:val="22"/>
-                <w:rFonts w:eastAsia="Microsoft JhengHei" w:ascii="Calibri" w:hAnsi="Calibri"/>
-              </w:rPr>
-              <w:t>+0</w:t>
+            <w:r>
+              <w:t>{{fx_sd280w_delta}}</w:t>
             </w:r>
           </w:p>
         </w:tc>
@@ -2508,18 +2488,8 @@
             <w:vAlign w:val="center"/>
           </w:tcPr>
           <w:p>
-            <w:pPr>
-              <w:jc w:val="center"/>
-            </w:pPr>
-            <w:r/>
-            <w:r>
-              <w:rPr>
-                <w:b w:val="0"/>
-                <w:color w:val="C00000"/>
-                <w:sz w:val="22"/>
-                <w:rFonts w:eastAsia="Microsoft JhengHei" w:ascii="Calibri" w:hAnsi="Calibri"/>
-              </w:rPr>
-              <w:t>+0</w:t>
+            <w:r>
+              <w:t>{{fx_sd420_delta}}</w:t>
             </w:r>
           </w:p>
         </w:tc>
@@ -2571,18 +2541,8 @@
             <w:vAlign w:val="center"/>
           </w:tcPr>
           <w:p>
-            <w:pPr>
-              <w:jc w:val="center"/>
-            </w:pPr>
-            <w:r/>
-            <w:r>
-              <w:rPr>
-                <w:b w:val="0"/>
-                <w:color w:val="C00000"/>
-                <w:sz w:val="22"/>
-                <w:rFonts w:eastAsia="Microsoft JhengHei" w:ascii="Calibri" w:hAnsi="Calibri"/>
-              </w:rPr>
-              <w:t>+0</w:t>
+            <w:r>
+              <w:t>{{fx_sd420w_delta}}</w:t>
             </w:r>
           </w:p>
         </w:tc>

</xml_diff>

<commit_message>
feat(search): add xiben adapter for 大陸方面 §六.3 slot
- New XibenAdapter scrapes 5 steelx2.com indices (鋼材/鐵礦砂/焦炭/廢鋼/鋼胚)
  via OpenAI web_search + extract_json; Python computes deltas and NT$
  conversion so LLM only assembles the final paragraph (no arithmetic).
- Week anchor locked to opening_monday(target_date), matching fengxing's
  Monday convention — avoids weekday mismatch between 豐興 vs 西本 numbers.
- Routes china_xiben_paragraph from weekly_market → xiben in slot_schema;
  drops the now-orphan plan entry and style example from weekly_market.
- Adds cny_to_twd_rate config setting (default 4.541, override via env).
- Template: colors §六.1 4-row 價差 column red (fx_sd{280,280w,420,420w}_delta).
- start-system.bat: CRLF + ASCII-only so cmd.exe parses the if/else blocks
  correctly under UAC-elevated session.

Co-Authored-By: Claude Opus 4.7 (1M context) <noreply@anthropic.com>
</commit_message>
<xml_diff>
--- a/backend/templates/meeting_template.docx
+++ b/backend/templates/meeting_template.docx
@@ -2383,6 +2383,9 @@
           </w:tcPr>
           <w:p>
             <w:r>
+              <w:rPr>
+                <w:color w:val="FF0000"/>
+              </w:rPr>
               <w:t>{{fx_sd280_delta}}</w:t>
             </w:r>
           </w:p>
@@ -2436,6 +2439,9 @@
           </w:tcPr>
           <w:p>
             <w:r>
+              <w:rPr>
+                <w:color w:val="FF0000"/>
+              </w:rPr>
               <w:t>{{fx_sd280w_delta}}</w:t>
             </w:r>
           </w:p>
@@ -2489,6 +2495,9 @@
           </w:tcPr>
           <w:p>
             <w:r>
+              <w:rPr>
+                <w:color w:val="FF0000"/>
+              </w:rPr>
               <w:t>{{fx_sd420_delta}}</w:t>
             </w:r>
           </w:p>
@@ -2542,6 +2551,9 @@
           </w:tcPr>
           <w:p>
             <w:r>
+              <w:rPr>
+                <w:color w:val="FF0000"/>
+              </w:rPr>
               <w:t>{{fx_sd420w_delta}}</w:t>
             </w:r>
           </w:p>

</xml_diff>